<commit_message>
Fill in the GitHub repository URL in the report
</commit_message>
<xml_diff>
--- a/PROG209_Java_Swing_Assignment_Report_Mohamed_Barry (1).docx
+++ b/PROG209_Java_Swing_Assignment_Report_Mohamed_Barry (1).docx
@@ -148,7 +148,7 @@
         <w:jc w:val="center"/>
       </w:pPr>
       <w:r>
-        <w:t>GitHub Repository: [Insert public repository URL before submission]</w:t>
+        <w:t>GitHub Repository: https://github.com/Sensationalbilly/JAVASWING-ASSIGNMENT</w:t>
       </w:r>
     </w:p>
     <w:p>
@@ -936,7 +936,7 @@
         <w:rPr>
           <w:b w:val="0"/>
         </w:rPr>
-        <w:t>Repository URL: [INSERT GITHUB REPOSITORY URL]</w:t>
+        <w:t>Repository URL: https://github.com/Sensationalbilly/JAVASWING-ASSIGNMENT</w:t>
       </w:r>
     </w:p>
     <w:p>

</xml_diff>